<commit_message>
Improve SoftwareX reviewer reproducibility
</commit_message>
<xml_diff>
--- a/paper/softwarex/manuscript/seraedit_softwarex.docx
+++ b/paper/softwarex/manuscript/seraedit_softwarex.docx
@@ -178,7 +178,12 @@
     </w:p>
     <w:p>
       <w:r>
-        <w:t>On Windows 11 (build 10.0.26200), Python 3.12.5, Node.js 24.16.0, and npm 11.13.0, the 2026-08-27 verification produced the following results. Automatic benchmark validation accepted 120/120 task definitions. Human inspection then completed 120/120 current primary decisions and a stratified 30/30 repeat check with zero stale records; all current decisions were compliant after the correction cycle. The append-only export retains 194 records, including superseded revision findings. Both passes used the same pseudonymous reviewer, so these data verify task instructions, scopes, Gold outputs, and host-visible notation but do not measure inter-rater reliability. The Python suite collected and passed 404 tests. Vitest passed 120 tests in 72 files, the Vite production build transformed 216 modules, and staged backend, compatibility launcher, and Electron desktop runtime smoke checks passed. The fresh softwarex_verification_120_v1 fixture run completed all 360 expected task-condition cases with zero execution errors. Its verifier confirmed matching configuration, benchmark, prompt, dependency and metric evidence. These are software verification results, not evidence that a language model achieves perfect edits; the experiment manifest explicitly sets formal_results_allowed to false.</w:t>
+        <w:t>For review, scripts/run_reviewer_demo.py runs six representative tasks through the actual local product entry point and writes a compact evidence report plus five host-openable MusicXML revisions (the sixth task is an expected refusal). It requires neither an API key nor a network connection. The included Windows CI workflow repeats the Python regression suite, benchmark validation, this reviewer demo, package audit, frontend tests, and production build on each push or pull request.</w:t>
+      </w:r>
+    </w:p>
+    <w:p>
+      <w:r>
+        <w:t>On Windows 11 (build 10.0.26200), Python 3.12.5, Node.js 24.16.0, and npm 11.13.0, the 2026-08-27 verification produced the following results. Automatic benchmark validation accepted 120/120 task definitions. Human inspection then completed 120/120 current primary decisions and a stratified 30/30 repeat check with zero stale records; all current decisions were compliant after the correction cycle. The append-only export retains 194 records, including superseded revision findings. Both passes used the same pseudonymous reviewer, so these data verify task instructions, scopes, Gold outputs, and host-visible notation but do not measure inter-rater reliability. The Python suite collected and passed 408 tests. Vitest passed 120 tests in 72 files, the Vite production build transformed 216 modules, and staged backend, compatibility launcher, and Electron desktop runtime smoke checks passed. The fresh softwarex_verification_120_v1 fixture run completed all 360 expected task-condition cases with zero execution errors. Its verifier confirmed matching configuration, benchmark, prompt, dependency and metric evidence. These are software verification results, not evidence that a language model achieves perfect edits; the experiment manifest explicitly sets formal_results_allowed to false.</w:t>
       </w:r>
     </w:p>
     <w:p>
@@ -191,6 +196,429 @@
         <w:t>We separately tested localization when the notation host supplied a wider selection than the measure named in the instruction. The robustness runner added one adjacent measure to each eligible explicit-measure request. It passed 240/240 bilingual runs; expansion was applicable in 174 runs, and all 174 retained the intended task result, protected content, and valid MusicXML. The remaining 66 tasks were not widened because the instruction did not name a specific measure, the source lacked an adjacent measure, or the operation was global. This regression set directly tests host-selection versus semantic-target resolution and remains deterministic product evidence, not model accuracy.</w:t>
       </w:r>
     </w:p>
+    <w:tbl>
+      <w:tblPr>
+        <w:tblStyle w:val="TableGrid"/>
+        <w:tblW w:type="auto" w:w="0"/>
+        <w:tblLook w:firstColumn="1" w:firstRow="1" w:lastColumn="0" w:lastRow="0" w:noHBand="0" w:noVBand="1" w:val="04A0"/>
+      </w:tblPr>
+      <w:tblGrid>
+        <w:gridCol w:w="2324"/>
+        <w:gridCol w:w="2324"/>
+        <w:gridCol w:w="2324"/>
+        <w:gridCol w:w="2324"/>
+      </w:tblGrid>
+      <w:tr>
+        <w:tc>
+          <w:tcPr>
+            <w:tcW w:type="dxa" w:w="2324"/>
+          </w:tcPr>
+          <w:p>
+            <w:r>
+              <w:rPr>
+                <w:rFonts w:ascii="Times New Roman" w:hAnsi="Times New Roman"/>
+                <w:b/>
+                <w:sz w:val="17"/>
+              </w:rPr>
+              <w:t>Evidence layer</w:t>
+            </w:r>
+          </w:p>
+        </w:tc>
+        <w:tc>
+          <w:tcPr>
+            <w:tcW w:type="dxa" w:w="2324"/>
+          </w:tcPr>
+          <w:p>
+            <w:r>
+              <w:rPr>
+                <w:rFonts w:ascii="Times New Roman" w:hAnsi="Times New Roman"/>
+                <w:b/>
+                <w:sz w:val="17"/>
+              </w:rPr>
+              <w:t>Scale</w:t>
+            </w:r>
+          </w:p>
+        </w:tc>
+        <w:tc>
+          <w:tcPr>
+            <w:tcW w:type="dxa" w:w="2324"/>
+          </w:tcPr>
+          <w:p>
+            <w:r>
+              <w:rPr>
+                <w:rFonts w:ascii="Times New Roman" w:hAnsi="Times New Roman"/>
+                <w:b/>
+                <w:sz w:val="17"/>
+              </w:rPr>
+              <w:t>Verified result</w:t>
+            </w:r>
+          </w:p>
+        </w:tc>
+        <w:tc>
+          <w:tcPr>
+            <w:tcW w:type="dxa" w:w="2324"/>
+          </w:tcPr>
+          <w:p>
+            <w:r>
+              <w:rPr>
+                <w:rFonts w:ascii="Times New Roman" w:hAnsi="Times New Roman"/>
+                <w:b/>
+                <w:sz w:val="17"/>
+              </w:rPr>
+              <w:t>Claim boundary</w:t>
+            </w:r>
+          </w:p>
+        </w:tc>
+      </w:tr>
+      <w:tr>
+        <w:tc>
+          <w:tcPr>
+            <w:tcW w:type="dxa" w:w="2324"/>
+          </w:tcPr>
+          <w:p>
+            <w:r>
+              <w:rPr>
+                <w:rFonts w:ascii="Times New Roman" w:hAnsi="Times New Roman"/>
+                <w:sz w:val="17"/>
+              </w:rPr>
+              <w:t>Benchmark definition</w:t>
+            </w:r>
+          </w:p>
+        </w:tc>
+        <w:tc>
+          <w:tcPr>
+            <w:tcW w:type="dxa" w:w="2324"/>
+          </w:tcPr>
+          <w:p>
+            <w:r>
+              <w:rPr>
+                <w:rFonts w:ascii="Times New Roman" w:hAnsi="Times New Roman"/>
+                <w:sz w:val="17"/>
+              </w:rPr>
+              <w:t>120 tasks / 20 scores</w:t>
+            </w:r>
+          </w:p>
+        </w:tc>
+        <w:tc>
+          <w:tcPr>
+            <w:tcW w:type="dxa" w:w="2324"/>
+          </w:tcPr>
+          <w:p>
+            <w:r>
+              <w:rPr>
+                <w:rFonts w:ascii="Times New Roman" w:hAnsi="Times New Roman"/>
+                <w:sz w:val="17"/>
+              </w:rPr>
+              <w:t>120/120 valid</w:t>
+            </w:r>
+          </w:p>
+        </w:tc>
+        <w:tc>
+          <w:tcPr>
+            <w:tcW w:type="dxa" w:w="2324"/>
+          </w:tcPr>
+          <w:p>
+            <w:r>
+              <w:rPr>
+                <w:rFonts w:ascii="Times New Roman" w:hAnsi="Times New Roman"/>
+                <w:sz w:val="17"/>
+              </w:rPr>
+              <w:t>Schema, Gold application, constraints, round trip</w:t>
+            </w:r>
+          </w:p>
+        </w:tc>
+      </w:tr>
+      <w:tr>
+        <w:tc>
+          <w:tcPr>
+            <w:tcW w:type="dxa" w:w="2324"/>
+          </w:tcPr>
+          <w:p>
+            <w:r>
+              <w:rPr>
+                <w:rFonts w:ascii="Times New Roman" w:hAnsi="Times New Roman"/>
+                <w:sz w:val="17"/>
+              </w:rPr>
+              <w:t>Automated regression</w:t>
+            </w:r>
+          </w:p>
+        </w:tc>
+        <w:tc>
+          <w:tcPr>
+            <w:tcW w:type="dxa" w:w="2324"/>
+          </w:tcPr>
+          <w:p>
+            <w:r>
+              <w:rPr>
+                <w:rFonts w:ascii="Times New Roman" w:hAnsi="Times New Roman"/>
+                <w:sz w:val="17"/>
+              </w:rPr>
+              <w:t>408 Python; 120 frontend</w:t>
+            </w:r>
+          </w:p>
+        </w:tc>
+        <w:tc>
+          <w:tcPr>
+            <w:tcW w:type="dxa" w:w="2324"/>
+          </w:tcPr>
+          <w:p>
+            <w:r>
+              <w:rPr>
+                <w:rFonts w:ascii="Times New Roman" w:hAnsi="Times New Roman"/>
+                <w:sz w:val="17"/>
+              </w:rPr>
+              <w:t>All passed</w:t>
+            </w:r>
+          </w:p>
+        </w:tc>
+        <w:tc>
+          <w:tcPr>
+            <w:tcW w:type="dxa" w:w="2324"/>
+          </w:tcPr>
+          <w:p>
+            <w:r>
+              <w:rPr>
+                <w:rFonts w:ascii="Times New Roman" w:hAnsi="Times New Roman"/>
+                <w:sz w:val="17"/>
+              </w:rPr>
+              <w:t>Software behavior on the tested environment</w:t>
+            </w:r>
+          </w:p>
+        </w:tc>
+      </w:tr>
+      <w:tr>
+        <w:tc>
+          <w:tcPr>
+            <w:tcW w:type="dxa" w:w="2324"/>
+          </w:tcPr>
+          <w:p>
+            <w:r>
+              <w:rPr>
+                <w:rFonts w:ascii="Times New Roman" w:hAnsi="Times New Roman"/>
+                <w:sz w:val="17"/>
+              </w:rPr>
+              <w:t>Reviewer demo</w:t>
+            </w:r>
+          </w:p>
+        </w:tc>
+        <w:tc>
+          <w:tcPr>
+            <w:tcW w:type="dxa" w:w="2324"/>
+          </w:tcPr>
+          <w:p>
+            <w:r>
+              <w:rPr>
+                <w:rFonts w:ascii="Times New Roman" w:hAnsi="Times New Roman"/>
+                <w:sz w:val="17"/>
+              </w:rPr>
+              <w:t>6 representative tasks</w:t>
+            </w:r>
+          </w:p>
+        </w:tc>
+        <w:tc>
+          <w:tcPr>
+            <w:tcW w:type="dxa" w:w="2324"/>
+          </w:tcPr>
+          <w:p>
+            <w:r>
+              <w:rPr>
+                <w:rFonts w:ascii="Times New Roman" w:hAnsi="Times New Roman"/>
+                <w:sz w:val="17"/>
+              </w:rPr>
+              <w:t>6/6 passed; five host files</w:t>
+            </w:r>
+          </w:p>
+        </w:tc>
+        <w:tc>
+          <w:tcPr>
+            <w:tcW w:type="dxa" w:w="2324"/>
+          </w:tcPr>
+          <w:p>
+            <w:r>
+              <w:rPr>
+                <w:rFonts w:ascii="Times New Roman" w:hAnsi="Times New Roman"/>
+                <w:sz w:val="17"/>
+              </w:rPr>
+              <w:t>Offline product-path reproducibility</w:t>
+            </w:r>
+          </w:p>
+        </w:tc>
+      </w:tr>
+      <w:tr>
+        <w:tc>
+          <w:tcPr>
+            <w:tcW w:type="dxa" w:w="2324"/>
+          </w:tcPr>
+          <w:p>
+            <w:r>
+              <w:rPr>
+                <w:rFonts w:ascii="Times New Roman" w:hAnsi="Times New Roman"/>
+                <w:sz w:val="17"/>
+              </w:rPr>
+              <w:t>Product replay</w:t>
+            </w:r>
+          </w:p>
+        </w:tc>
+        <w:tc>
+          <w:tcPr>
+            <w:tcW w:type="dxa" w:w="2324"/>
+          </w:tcPr>
+          <w:p>
+            <w:r>
+              <w:rPr>
+                <w:rFonts w:ascii="Times New Roman" w:hAnsi="Times New Roman"/>
+                <w:sz w:val="17"/>
+              </w:rPr>
+              <w:t>720 bilingual runs</w:t>
+            </w:r>
+          </w:p>
+        </w:tc>
+        <w:tc>
+          <w:tcPr>
+            <w:tcW w:type="dxa" w:w="2324"/>
+          </w:tcPr>
+          <w:p>
+            <w:r>
+              <w:rPr>
+                <w:rFonts w:ascii="Times New Roman" w:hAnsi="Times New Roman"/>
+                <w:sz w:val="17"/>
+              </w:rPr>
+              <w:t>720/720; 660 host exports</w:t>
+            </w:r>
+          </w:p>
+        </w:tc>
+        <w:tc>
+          <w:tcPr>
+            <w:tcW w:type="dxa" w:w="2324"/>
+          </w:tcPr>
+          <w:p>
+            <w:r>
+              <w:rPr>
+                <w:rFonts w:ascii="Times New Roman" w:hAnsi="Times New Roman"/>
+                <w:sz w:val="17"/>
+              </w:rPr>
+              <w:t>Deterministic local generator, not remote-LLM accuracy</w:t>
+            </w:r>
+          </w:p>
+        </w:tc>
+      </w:tr>
+      <w:tr>
+        <w:tc>
+          <w:tcPr>
+            <w:tcW w:type="dxa" w:w="2324"/>
+          </w:tcPr>
+          <w:p>
+            <w:r>
+              <w:rPr>
+                <w:rFonts w:ascii="Times New Roman" w:hAnsi="Times New Roman"/>
+                <w:sz w:val="17"/>
+              </w:rPr>
+              <w:t>Wider host selection</w:t>
+            </w:r>
+          </w:p>
+        </w:tc>
+        <w:tc>
+          <w:tcPr>
+            <w:tcW w:type="dxa" w:w="2324"/>
+          </w:tcPr>
+          <w:p>
+            <w:r>
+              <w:rPr>
+                <w:rFonts w:ascii="Times New Roman" w:hAnsi="Times New Roman"/>
+                <w:sz w:val="17"/>
+              </w:rPr>
+              <w:t>240 bilingual runs</w:t>
+            </w:r>
+          </w:p>
+        </w:tc>
+        <w:tc>
+          <w:tcPr>
+            <w:tcW w:type="dxa" w:w="2324"/>
+          </w:tcPr>
+          <w:p>
+            <w:r>
+              <w:rPr>
+                <w:rFonts w:ascii="Times New Roman" w:hAnsi="Times New Roman"/>
+                <w:sz w:val="17"/>
+              </w:rPr>
+              <w:t>240/240; 174 widened</w:t>
+            </w:r>
+          </w:p>
+        </w:tc>
+        <w:tc>
+          <w:tcPr>
+            <w:tcW w:type="dxa" w:w="2324"/>
+          </w:tcPr>
+          <w:p>
+            <w:r>
+              <w:rPr>
+                <w:rFonts w:ascii="Times New Roman" w:hAnsi="Times New Roman"/>
+                <w:sz w:val="17"/>
+              </w:rPr>
+              <w:t>Semantic target remains narrower than authorization</w:t>
+            </w:r>
+          </w:p>
+        </w:tc>
+      </w:tr>
+      <w:tr>
+        <w:tc>
+          <w:tcPr>
+            <w:tcW w:type="dxa" w:w="2324"/>
+          </w:tcPr>
+          <w:p>
+            <w:r>
+              <w:rPr>
+                <w:rFonts w:ascii="Times New Roman" w:hAnsi="Times New Roman"/>
+                <w:sz w:val="17"/>
+              </w:rPr>
+              <w:t>Human task review</w:t>
+            </w:r>
+          </w:p>
+        </w:tc>
+        <w:tc>
+          <w:tcPr>
+            <w:tcW w:type="dxa" w:w="2324"/>
+          </w:tcPr>
+          <w:p>
+            <w:r>
+              <w:rPr>
+                <w:rFonts w:ascii="Times New Roman" w:hAnsi="Times New Roman"/>
+                <w:sz w:val="17"/>
+              </w:rPr>
+              <w:t>120 primary + 30 repeat</w:t>
+            </w:r>
+          </w:p>
+        </w:tc>
+        <w:tc>
+          <w:tcPr>
+            <w:tcW w:type="dxa" w:w="2324"/>
+          </w:tcPr>
+          <w:p>
+            <w:r>
+              <w:rPr>
+                <w:rFonts w:ascii="Times New Roman" w:hAnsi="Times New Roman"/>
+                <w:sz w:val="17"/>
+              </w:rPr>
+              <w:t>Complete; zero stale</w:t>
+            </w:r>
+          </w:p>
+        </w:tc>
+        <w:tc>
+          <w:tcPr>
+            <w:tcW w:type="dxa" w:w="2324"/>
+          </w:tcPr>
+          <w:p>
+            <w:r>
+              <w:rPr>
+                <w:rFonts w:ascii="Times New Roman" w:hAnsi="Times New Roman"/>
+                <w:sz w:val="17"/>
+              </w:rPr>
+              <w:t>Same reviewer; no inter-rater or aesthetic claim</w:t>
+            </w:r>
+          </w:p>
+        </w:tc>
+      </w:tr>
+    </w:tbl>
     <w:p>
       <w:pPr>
         <w:pStyle w:val="Heading1"/>
@@ -601,7 +1029,7 @@
                 <w:rFonts w:ascii="Times New Roman" w:hAnsi="Times New Roman"/>
                 <w:sz w:val="17"/>
               </w:rPr>
-              <w:t>Python &gt;=3.10; Node.js/npm for development; Windows 10/11 desktop; dependencies in requirements.txt and npm lock files</w:t>
+              <w:t>Python &gt;=3.10; Node.js/npm for interface development; Windows 10/11 desktop; requirements, tested Windows constraints, and npm lock files</w:t>
             </w:r>
           </w:p>
         </w:tc>
@@ -645,7 +1073,7 @@
                 <w:rFonts w:ascii="Times New Roman" w:hAnsi="Times New Roman"/>
                 <w:sz w:val="17"/>
               </w:rPr>
-              <w:t>docs/softwarex/API_REFERENCE.md, INSTALLATION.md, USER_MANUAL.md, and generated OpenAPI /docs</w:t>
+              <w:t>docs/softwarex/API_REFERENCE.md, INSTALLATION.md, USER_MANUAL.md, REVIEWER_GUIDE.md, and generated OpenAPI /docs</w:t>
             </w:r>
           </w:p>
         </w:tc>

</xml_diff>

<commit_message>
Add author metadata to SoftwareX package
</commit_message>
<xml_diff>
--- a/paper/softwarex/manuscript/seraedit_softwarex.docx
+++ b/paper/softwarex/manuscript/seraedit_softwarex.docx
@@ -13,7 +13,22 @@
     </w:p>
     <w:p>
       <w:r>
-        <w:t>[AUTHOR GIVEN NAME] [AUTHOR FAMILY NAME] [AFFILIATION, POSTAL ADDRESS, COUNTRY] Corresponding author: [SUPPORT EMAIL] ORCID: [ORCID]</w:t>
+        <w:t>Yuan Gao</w:t>
+      </w:r>
+    </w:p>
+    <w:p>
+      <w:r>
+        <w:t>Zhejiang Conservatory of Music, No. 1 Zheyin Road, Zhuantang Street, Xihu District, Hangzhou, Zhejiang Province, China 310024</w:t>
+      </w:r>
+    </w:p>
+    <w:p>
+      <w:r>
+        <w:t>Corresponding author: [SUPPORT EMAIL]</w:t>
+      </w:r>
+    </w:p>
+    <w:p>
+      <w:r>
+        <w:t>ORCID: 0009-0005-0394-3623</w:t>
       </w:r>
     </w:p>
     <w:p>
@@ -1552,7 +1567,7 @@
     </w:p>
     <w:p>
       <w:r>
-        <w:t>[AUTHOR NAME]: Conceptualization, Methodology, Software, Validation, Investigation, Data curation, Writing – original draft, Writing – review &amp; editing, Visualization. Edit the roles to reflect actual contributions before submission.</w:t>
+        <w:t>Yuan Gao: Conceptualization, Methodology, Software, Validation, Investigation, Data curation, Writing – original draft, Writing – review &amp; editing, Visualization.</w:t>
       </w:r>
     </w:p>
     <w:p>
@@ -1565,7 +1580,7 @@
     </w:p>
     <w:p>
       <w:r>
-        <w:t>[FUNDING STATEMENT OR: This research did not receive any specific grant from funding agencies in the public, commercial, or not-for-profit sectors.]</w:t>
+        <w:t>This research did not receive any specific grant from funding agencies in the public, commercial, or not-for-profit sectors.</w:t>
       </w:r>
     </w:p>
     <w:p>

</xml_diff>

<commit_message>
Finalize SoftwareX author declarations
</commit_message>
<xml_diff>
--- a/paper/softwarex/manuscript/seraedit_softwarex.docx
+++ b/paper/softwarex/manuscript/seraedit_softwarex.docx
@@ -23,7 +23,7 @@
     </w:p>
     <w:p>
       <w:r>
-        <w:t>Corresponding author: [SUPPORT EMAIL]</w:t>
+        <w:t>Corresponding author: selanceg@gmail.com</w:t>
       </w:r>
     </w:p>
     <w:p>
@@ -1132,7 +1132,7 @@
                 <w:rFonts w:ascii="Times New Roman" w:hAnsi="Times New Roman"/>
                 <w:sz w:val="17"/>
               </w:rPr>
-              <w:t>[SUPPORT EMAIL]</w:t>
+              <w:t>selanceg@gmail.com</w:t>
             </w:r>
           </w:p>
         </w:tc>
@@ -1551,7 +1551,7 @@
                 <w:rFonts w:ascii="Times New Roman" w:hAnsi="Times New Roman"/>
                 <w:sz w:val="17"/>
               </w:rPr>
-              <w:t>[SUPPORT EMAIL]</w:t>
+              <w:t>selanceg@gmail.com</w:t>
             </w:r>
           </w:p>
         </w:tc>
@@ -1593,7 +1593,7 @@
     </w:p>
     <w:p>
       <w:r>
-        <w:t>[THE AUTHORS DECLARE NO KNOWN COMPETING INTERESTS, OR INSERT THE REQUIRED DISCLOSURE.]</w:t>
+        <w:t>The author declares that there are no known competing financial interests or personal relationships that could have appeared to influence the work reported in this paper.</w:t>
       </w:r>
     </w:p>
     <w:p>

</xml_diff>

<commit_message>
Prepare SeraEdit 1.0.0 release candidate
</commit_message>
<xml_diff>
--- a/paper/softwarex/manuscript/seraedit_softwarex.docx
+++ b/paper/softwarex/manuscript/seraedit_softwarex.docx
@@ -780,7 +780,7 @@
                 <w:rFonts w:ascii="Times New Roman" w:hAnsi="Times New Roman"/>
                 <w:sz w:val="17"/>
               </w:rPr>
-              <w:t>1.0.0-dev.14</w:t>
+              <w:t>1.0.0</w:t>
             </w:r>
           </w:p>
         </w:tc>
@@ -1243,7 +1243,7 @@
                 <w:rFonts w:ascii="Times New Roman" w:hAnsi="Times New Roman"/>
                 <w:sz w:val="17"/>
               </w:rPr>
-              <w:t>1.0.0-dev.14</w:t>
+              <w:t>1.0.0</w:t>
             </w:r>
           </w:p>
         </w:tc>

</xml_diff>

<commit_message>
Finalize SeraEdit 1.0.0 public release metadata
</commit_message>
<xml_diff>
--- a/paper/softwarex/manuscript/seraedit_softwarex.docx
+++ b/paper/softwarex/manuscript/seraedit_softwarex.docx
@@ -672,7 +672,7 @@
     </w:p>
     <w:p>
       <w:r>
-        <w:t>SeraEdit packages language-guided MusicXML editing as a source-bound, scoped, validated, and reversible transaction. Its principal contribution is an executable reliability boundary: the model proposes, while canonical score state, deterministic validators, protected-scope comparison, MusicXML round trips, and user review decide whether a revision exists. The open-source release candidate includes a desktop demonstration, host bridge, benchmark, three evaluation conditions, automated metrics, tests, and reproducibility tooling. Future releases will prioritize formal model comparisons, cross-host testing, richer exact notation relations, and independent blinded musician evaluation rather than weakening transaction safeguards.</w:t>
+        <w:t>SeraEdit packages language-guided MusicXML editing as a source-bound, scoped, validated, and reversible transaction. Its principal contribution is an executable reliability boundary: the model proposes, while canonical score state, deterministic validators, protected-scope comparison, MusicXML round trips, and user review decide whether a revision exists. The open-source release includes a desktop demonstration, host bridge, benchmark, three evaluation conditions, automated metrics, tests, and reproducibility tooling. Future releases will prioritize formal model comparisons, cross-host testing, richer exact notation relations, and independent blinded musician evaluation rather than weakening transaction safeguards.</w:t>
       </w:r>
     </w:p>
     <w:p>
@@ -824,7 +824,7 @@
                 <w:rFonts w:ascii="Times New Roman" w:hAnsi="Times New Roman"/>
                 <w:sz w:val="17"/>
               </w:rPr>
-              <w:t>https://github.com/Selancee/Sera (must be made public and tagged before submission)</w:t>
+              <w:t>https://github.com/Selancee/Sera/releases/tag/v1.0.0</w:t>
             </w:r>
           </w:p>
         </w:tc>
@@ -1287,7 +1287,7 @@
                 <w:rFonts w:ascii="Times New Roman" w:hAnsi="Times New Roman"/>
                 <w:sz w:val="17"/>
               </w:rPr>
-              <w:t>[RELEASE ASSET URL]</w:t>
+              <w:t>https://github.com/Selancee/Sera/releases/download/v1.0.0/Sera-1.0.0-x64.exe</w:t>
             </w:r>
           </w:p>
         </w:tc>
@@ -1606,7 +1606,7 @@
     </w:p>
     <w:p>
       <w:r>
-        <w:t>Source code, synthetic benchmark data, test fixtures, evaluation configuration, and the non-formal verification run will be available from the tagged public repository and permanent archive listed in C2-C3. No API key is distributed.</w:t>
+        <w:t>Source code, synthetic benchmark data, test fixtures, evaluation configuration, and the non-formal verification run are available from the tagged public repository in C2. The permanent archive in C3 will be inserted after DOI registration. No API key is distributed.</w:t>
       </w:r>
     </w:p>
     <w:p>

</xml_diff>

<commit_message>
docs: integrate reserved Zenodo DOI
</commit_message>
<xml_diff>
--- a/paper/softwarex/manuscript/seraedit_softwarex.docx
+++ b/paper/softwarex/manuscript/seraedit_softwarex.docx
@@ -868,7 +868,7 @@
                 <w:rFonts w:ascii="Times New Roman" w:hAnsi="Times New Roman"/>
                 <w:sz w:val="17"/>
               </w:rPr>
-              <w:t>[ZENODO OR CODE OCEAN DOI/URL]</w:t>
+              <w:t>https://doi.org/10.5281/zenodo.22128976</w:t>
             </w:r>
           </w:p>
         </w:tc>
@@ -1331,7 +1331,7 @@
                 <w:rFonts w:ascii="Times New Roman" w:hAnsi="Times New Roman"/>
                 <w:sz w:val="17"/>
               </w:rPr>
-              <w:t>[ZENODO OR CODE OCEAN DOI/URL]</w:t>
+              <w:t>https://doi.org/10.5281/zenodo.22128976</w:t>
             </w:r>
           </w:p>
         </w:tc>
@@ -1606,7 +1606,7 @@
     </w:p>
     <w:p>
       <w:r>
-        <w:t>Source code, synthetic benchmark data, test fixtures, evaluation configuration, and the non-formal verification run are available from the tagged public repository in C2. The permanent archive in C3 will be inserted after DOI registration. No API key is distributed.</w:t>
+        <w:t>Source code, synthetic benchmark data, test fixtures, evaluation configuration, and the non-formal verification run are available from the tagged public repository in C2. Zenodo has reserved 10.5281/zenodo.22128976 for the versioned deposit in C3; public DOI resolution begins when the corresponding author publishes that deposit. No API key is distributed.</w:t>
       </w:r>
     </w:p>
     <w:p>

</xml_diff>

<commit_message>
docs: prepare SoftwareX Editorial Manager submission
</commit_message>
<xml_diff>
--- a/paper/softwarex/manuscript/seraedit_softwarex.docx
+++ b/paper/softwarex/manuscript/seraedit_softwarex.docx
@@ -1614,6 +1614,19 @@
         <w:pStyle w:val="Heading1"/>
       </w:pPr>
       <w:r>
+        <w:t>Declaration of generative AI and AI-assisted technologies in the manuscript preparation process</w:t>
+      </w:r>
+    </w:p>
+    <w:p>
+      <w:r>
+        <w:t>During preparation of this work, the author used OpenAI Codex to assist with source code implementation, testing, documentation structuring, and language editing. The author reviewed and edited all generated material and takes full responsibility for the content of the publication. No AI system is listed as an author.</w:t>
+      </w:r>
+    </w:p>
+    <w:p>
+      <w:pPr>
+        <w:pStyle w:val="Heading1"/>
+      </w:pPr>
+      <w:r>
         <w:t>References</w:t>
       </w:r>
     </w:p>

</xml_diff>